<commit_message>
fix(ai-chat): resolve SSL verify issue, update Groq model to compound-mini, add anti-spam rate limiting & updated Section 1.3 docs
</commit_message>
<xml_diff>
--- a/docs/documents/Chapter_1_Final_Format.docx
+++ b/docs/documents/Chapter_1_Final_Format.docx
@@ -381,46 +381,54 @@
     </w:p>
     <w:p>
       <w:pPr>
-        <w:ind w:firstLine="720"/>
-        <w:jc w:val="both"/>
+        <w:jc w:val="left"/>
       </w:pPr>
       <w:r>
-        <w:t>This study focuses on the design, development, and evaluation of an Intelligent Legislative Management System (ILMS) with Groq LLM-Powered Similarity Checks, Automated Completeness Verification, and Plain-Language Public Registry, officially named the Ordinance and Resolution Lifecycle Management System (ORLMS) tailored for the City of San Jose del Monte (CSJDM), Bulacan. The system is intended to serve as the centralized legislative and policy-management platform within the Office of the Sangguniang Panlungsod. Its primary purpose is to help the legislative secretariat and council members transition from manual document handling and basic Microsoft Excel logging into a secure digital workflow, while using artificial intelligence to detect document redundancies, verify legal structures, and translate dense legal jargon into plain language. By centralizing municipal records and automating policy checks, the system provides local officials with data-driven support for policy-making.</w:t>
+        <w:rPr>
+          <w:b/>
+          <w:i/>
+          <w:sz w:val="24"/>
+        </w:rPr>
+        <w:t>1.3.1 Context</w:t>
       </w:r>
     </w:p>
     <w:p>
       <w:pPr>
+        <w:ind w:firstLine="720"/>
         <w:jc w:val="both"/>
       </w:pPr>
       <w:r>
-        <w:t>The scope of the system is defined by its functional modules, which include:</w:t>
+        <w:t>Local legislative management in the Philippines remains one of the most underserved areas of public sector digitization, despite the growing administrative demands placed on city and municipal councils. The Sangguniang Panlungsod, as the primary legislative body of component cities, is mandated under Republic Act No. 7160 to continuously enact, amend, and archive ordinances and resolutions governing local public affairs. In practice, however, the secretariats of these legislative offices operate without dedicated software systems, relying instead on physical document routing, manual logbooks, and basic spreadsheet tools that are insufficient to manage the volume, complexity, and legal precision required by modern municipal governance. Academic studies and e-governance initiatives have consistently emphasized that local government units lacking integrated digital workflows experience significant bottlenecks in policy deliberation, high risks of document misplacement, and limited public access to enacted legislation — all of which directly undermine administrative efficiency and civic transparency. The City of San Jose del Monte (CSJDM), Bulacan, with its population of over 651,000 and its rapid urbanization, presents a compelling and urgent case for the digitization of its legislative processes through an intelligent, AI-powered management platform.</w:t>
       </w:r>
     </w:p>
     <w:p>
       <w:pPr>
-        <w:pStyle w:val="ListBullet"/>
-        <w:jc w:val="both"/>
+        <w:jc w:val="left"/>
       </w:pPr>
       <w:r>
-        <w:t>User Authentication and Role-Based Access Control (RBAC): Ensures secure access for the super administrators, legislative staff, committee members, and Sangguniang Panlungsod (SP) members, with permissions restricted based on assigned roles.</w:t>
+        <w:rPr>
+          <w:b/>
+          <w:i/>
+          <w:sz w:val="24"/>
+        </w:rPr>
+        <w:t>1.3.2 Project Scope</w:t>
       </w:r>
     </w:p>
     <w:p>
       <w:pPr>
-        <w:pStyle w:val="ListBullet"/>
+        <w:ind w:firstLine="720"/>
         <w:jc w:val="both"/>
       </w:pPr>
       <w:r>
-        <w:t>Ordinance and Resolution Registry Module: Facilitates the digital creation, editing, and uploading of legislative drafts, automatically assigning unique tracking numbers and filing dates into the PostgreSQL database.</w:t>
+        <w:t>This capstone project focuses on the design, development, and evaluation of the Ordinance and Resolution Lifecycle Management System (ORLMS), a web-based platform tailored specifically for the Office of the Sangguniang Panlungsod of the City of San Jose del Monte, Bulacan. Built on a PHP MVC architecture and a MySQL database, the system serves as the centralized legislative management platform of the office, enabling the secretariat to manage the full legislative lifecycle — from initial draft submission to official enactment and public publication — within one secure digital environment.</w:t>
       </w:r>
     </w:p>
     <w:p>
       <w:pPr>
-        <w:pStyle w:val="ListBullet"/>
         <w:jc w:val="both"/>
       </w:pPr>
       <w:r>
-        <w:t>AI-Powered Validation Engine: Integrates the Groq Cloud API (Llama models) to automatically analyze submitted drafts for structural completeness (checking for the title, enacting clause, penal clause, and effectivity dates) and semantic similarity against existing laws to prevent duplicate policy enactments.</w:t>
+        <w:t>The scope encompasses ten (10) critical functional areas:</w:t>
       </w:r>
     </w:p>
     <w:p>
@@ -429,7 +437,7 @@
         <w:jc w:val="both"/>
       </w:pPr>
       <w:r>
-        <w:t>Committee Review and Deliberation Module: Routes submitted drafts to assigned committee desks, allowing members to review the text alongside AI validation reports, write deliberation remarks, and submit official recommendations.</w:t>
+        <w:t>User Authentication and Role-Based Access Control (RBAC): Restricts permissions and system capabilities based on assigned user roles (Super Admin, Legislative Secretariat, Committee Chair/Members, SP Councilors, LCE/Mayor).</w:t>
       </w:r>
     </w:p>
     <w:p>
@@ -438,7 +446,7 @@
         <w:jc w:val="both"/>
       </w:pPr>
       <w:r>
-        <w:t>Plenary Reading and Session Voting Tracker: Manages the progression of documents through the first, second, and third readings, providing a digital interface to record and tally the official session votes of SP Members.</w:t>
+        <w:t>Ordinance and Resolution Registry Management: Facilitates digital creation, editing, file uploading, indexing, and tracking of draft ordinances and resolutions.</w:t>
       </w:r>
     </w:p>
     <w:p>
@@ -447,7 +455,7 @@
         <w:jc w:val="both"/>
       </w:pPr>
       <w:r>
-        <w:t>Executive Approval and Veto Router: Routes approved bills to the Local Chief Executive (LCE / City Mayor) for final signature or veto recording, including logging veto messages back to the council.</w:t>
+        <w:t>AI-Powered Structural Completeness &amp; Semantic Similarity Validation: Integrates the Groq Cloud API (Llama LLMs) to evaluate structural legal compliance (checking title, enacting clause, penal clause, severability, effectivity) and detect semantic conflicts/redundancies against existing legislative records.</w:t>
       </w:r>
     </w:p>
     <w:p>
@@ -456,7 +464,7 @@
         <w:jc w:val="both"/>
       </w:pPr>
       <w:r>
-        <w:t>Amendments Subsystem Module: Tracks and documents proposed modifications or historical changes applied to enacted ordinances and resolutions.</w:t>
+        <w:t>Committee Review &amp; Deliberation Workflow: Manages digital document routing to committee desks, allowing members to review drafts alongside AI validation reports, write deliberation notes, and issue committee recommendations.</w:t>
       </w:r>
     </w:p>
     <w:p>
@@ -465,7 +473,7 @@
         <w:jc w:val="both"/>
       </w:pPr>
       <w:r>
-        <w:t>Plain-Language Public Registry Portal: Provides a guest-accessible website where citizens of San Jose del Monte can search for active local laws, download official copies, and read AI-generated plain-language summaries.</w:t>
+        <w:t>Plenary Reading &amp; Session Vote Tracking: Tracks document progression across first, second, and third readings, recording and tallying councilors' votes during legislative sessions.</w:t>
       </w:r>
     </w:p>
     <w:p>
@@ -474,7 +482,7 @@
         <w:jc w:val="both"/>
       </w:pPr>
       <w:r>
-        <w:t>Implementation Monitoring Module: Allows legislative staff to log and update the enforcement status of enacted laws (Pending, Ongoing, Completed, Delayed) alongside remarks.</w:t>
+        <w:t>Executive Approval &amp; Veto Routing: Enables electronic routing of passed measures to the Local Chief Executive (City Mayor) for final signature approval or veto recording with logged veto justification messages.</w:t>
       </w:r>
     </w:p>
     <w:p>
@@ -483,34 +491,92 @@
         <w:jc w:val="both"/>
       </w:pPr>
       <w:r>
-        <w:t>System Audit Logs Module: Automatically records system activity (CREATE, UPDATE, DELETE, LOGIN) with IP addresses and user accounts to ensure data integrity and transparency.</w:t>
+        <w:t>Amendments &amp; Version History Management: Maintains an immutable version history of proposed modifications and textual revisions made throughout the legislative lifecycle.</w:t>
       </w:r>
     </w:p>
     <w:p>
       <w:pPr>
-        <w:ind w:firstLine="720"/>
+        <w:pStyle w:val="ListBullet"/>
         <w:jc w:val="both"/>
       </w:pPr>
       <w:r>
-        <w:t>In addition to these modules, the system generates a range of reports and outputs such as ordinance and resolution draft PDFs, AI validation and similarity reports, committee deliberation logs, session voting tally summaries, LCE veto reports, plain-language summaries, implementation status reports, and system audit logs. These outputs are designed to support local officials and legal officers in making informed, data-driven decisions.</w:t>
+        <w:t>Plain-Language Public Registry Portal: Features a guest-accessible public portal publishing AI-generated plain-language summaries of enacted ordinances alongside official downloadable PDFs to promote civic transparency.</w:t>
       </w:r>
     </w:p>
     <w:p>
       <w:pPr>
-        <w:ind w:firstLine="720"/>
+        <w:pStyle w:val="ListBullet"/>
         <w:jc w:val="both"/>
       </w:pPr>
       <w:r>
-        <w:t>The evaluation of the system is limited to software quality assessment using ISO/IEC 25010 standards, specifically focusing on functional suitability, performance efficiency, security, reliability, and usability. The assessment will involve intended users (legislative secretaries, committee members, SP councilors), management personnel, and IT experts to ensure the system meets both technical and municipal requirements.</w:t>
+        <w:t>Implementation Monitoring Module: Enables legislative staff to track and update the post-enactment enforcement status (Pending, Ongoing, Completed, Delayed) of enacted policies.</w:t>
       </w:r>
     </w:p>
     <w:p>
       <w:pPr>
+        <w:pStyle w:val="ListBullet"/>
+        <w:jc w:val="both"/>
+      </w:pPr>
+      <w:r>
+        <w:t>System Audit Logging: Automatically records tamper-evident logs of all system operations (CREATE, READ, UPDATE, DELETE, LOGIN) with timestamps and user details to protect data integrity.</w:t>
+      </w:r>
+    </w:p>
+    <w:p>
+      <w:pPr>
         <w:ind w:firstLine="720"/>
         <w:jc w:val="both"/>
       </w:pPr>
       <w:r>
-        <w:t>The scope of this study does not extend to other general operations of the City Government of San Jose del Monte, Bulacan, such as business permit processing, municipal payroll, real property tax assessment, human resource management, civil registry, or law enforcement tracking. Furthermore, the system is designed for use within the single organizational environment of the Sangguniang Panlungsod of CSJDM and does not include integration with external national enterprise systems, government databases (e.g., Sangguniang Panlalawigan internal networks), or third-party cloud HR platforms.</w:t>
+        <w:t>The project scope includes system analysis, architectural design, database modeling, full web application implementation, and empirical quality evaluation. System quality is evaluated using the ISO/IEC 25010 Software Quality Model across five key quality characteristics: Functional Suitability, Performance Efficiency, Security, Reliability, and Usability. Evaluation respondents are drawn from legislative secretariats, committee members, SP councilors, and IT professionals.</w:t>
+      </w:r>
+    </w:p>
+    <w:p>
+      <w:pPr>
+        <w:jc w:val="left"/>
+      </w:pPr>
+      <w:r>
+        <w:rPr>
+          <w:b/>
+          <w:i/>
+          <w:sz w:val="24"/>
+        </w:rPr>
+        <w:t>1.3.3 Project Boundaries (Out-of-Scope)</w:t>
+      </w:r>
+    </w:p>
+    <w:p>
+      <w:pPr>
+        <w:ind w:firstLine="720"/>
+        <w:jc w:val="both"/>
+      </w:pPr>
+      <w:r>
+        <w:t>The boundaries of this project are defined by its exclusive focus on the legislative operations of the Sangguniang Panlungsod of CSJDM. Specifically, the out-of-scope parameters include:</w:t>
+      </w:r>
+    </w:p>
+    <w:p>
+      <w:pPr>
+        <w:pStyle w:val="ListBullet"/>
+        <w:jc w:val="both"/>
+      </w:pPr>
+      <w:r>
+        <w:t>Exclusion of General Municipal Operations: The system does not extend to other general LGU operations of the City Government of San Jose del Monte, such as business permit and licensing, municipal payroll, real property tax assessment, human resource management, civil registry, or law enforcement tracking.</w:t>
+      </w:r>
+    </w:p>
+    <w:p>
+      <w:pPr>
+        <w:pStyle w:val="ListBullet"/>
+        <w:jc w:val="both"/>
+      </w:pPr>
+      <w:r>
+        <w:t>Exclusion of External Systems Integration: The platform is restricted to the internal organizational environment of the SP Secretariat and does not integrate with external national government databases, Sangguniang Panlalawigan internal networks, or third-party cloud enterprise systems.</w:t>
+      </w:r>
+    </w:p>
+    <w:p>
+      <w:pPr>
+        <w:pStyle w:val="ListBullet"/>
+        <w:jc w:val="both"/>
+      </w:pPr>
+      <w:r>
+        <w:t>Decision-Support Role of Artificial Intelligence: The AI Validation Engine operates strictly in an advisory/decision-support capacity. Final legislative authority over bill drafting, committee endorsement, voting, enactment, and vetoing remains strictly with the SP Councilors and the Local Chief Executive.</w:t>
       </w:r>
     </w:p>
     <w:p>

</xml_diff>